<commit_message>
Use start/end time windows and bbox for annotation fields
Replace timestamp_sec with start_sec/end_sec intervals, require
bbox coordinates for location-related attributes across video/image
specs (full and core), sync criteria timing rules, and add
commented JSONC demo samples under annotation_examples/.

Co-authored-by: daffxx14526 <daffxx14526@users.noreply.github.com>
</commit_message>
<xml_diff>
--- a/docs_word/accident_annotation_criteria.docx
+++ b/docs_word/accident_annotation_criteria.docx
@@ -4269,7 +4269,7 @@
           <w:color w:val="555555"/>
           <w:sz w:val="22"/>
         </w:rPr>
-        <w:t xml:space="preserve">配套视频标注规范 v4：事件级纯时间字段 + 时序属性 </w:t>
+        <w:t xml:space="preserve">配套视频标注规范 v6：事件级纯时间字段 + 时序属性 </w:t>
       </w:r>
       <w:r>
         <w:rPr>
@@ -4279,7 +4279,7 @@
           <w:color w:val="555555"/>
           <w:sz w:val="20"/>
         </w:rPr>
-        <w:t>{value, timestamp_sec}</w:t>
+        <w:t>{value, start_sec, end_sec[, bbox]}</w:t>
       </w:r>
       <w:r>
         <w:rPr>
@@ -4310,7 +4310,27 @@
           <w:sz w:val="22"/>
         </w:rPr>
         <w:br/>
-        <w:t>时间原点为视频起点，单位秒，精度 0.1s。</w:t>
+        <w:t xml:space="preserve">时间原点为视频起点，单位秒，精度 0.1s；位置相关属性另标 </w:t>
+      </w:r>
+      <w:r>
+        <w:rPr>
+          <w:rFonts w:ascii="Consolas" w:hAnsi="Consolas" w:eastAsia="Microsoft YaHei"/>
+          <w:b w:val="0"/>
+          <w:i/>
+          <w:color w:val="555555"/>
+          <w:sz w:val="20"/>
+        </w:rPr>
+        <w:t>bbox=[x,y,w,h]</w:t>
+      </w:r>
+      <w:r>
+        <w:rPr>
+          <w:rFonts w:ascii="Calibri" w:hAnsi="Calibri" w:eastAsia="Microsoft YaHei"/>
+          <w:b w:val="0"/>
+          <w:i/>
+          <w:color w:val="555555"/>
+          <w:sz w:val="22"/>
+        </w:rPr>
+        <w:t>。</w:t>
       </w:r>
       <w:r>
         <w:rPr>
@@ -4456,7 +4476,7 @@
         <w:pStyle w:val="Heading3"/>
       </w:pPr>
       <w:r>
-        <w:t>9.3 collision_moment_sec</w:t>
+        <w:t>9.3 collision_moment_start_sec / collision_moment_end_sec</w:t>
       </w:r>
     </w:p>
     <w:p>
@@ -4472,7 +4492,7 @@
           <w:color w:val="222222"/>
           <w:sz w:val="18"/>
         </w:rPr>
-        <w:t>碰撞接触瞬间（两目标首次发生接触/撞击的时刻）。</w:t>
+        <w:t>碰撞接触时间窗（两目标发生接触/撞击的起止）。</w:t>
       </w:r>
     </w:p>
     <w:p>
@@ -4488,7 +4508,7 @@
           <w:color w:val="222222"/>
           <w:sz w:val="18"/>
         </w:rPr>
-        <w:t>填写条件：collision_moment_visible = 是 → 必填；</w:t>
+        <w:t>填写条件：collision_moment_visible = 是 → 二者必填；</w:t>
       </w:r>
     </w:p>
     <w:p>
@@ -4520,15 +4540,7 @@
           <w:color w:val="222222"/>
           <w:sz w:val="18"/>
         </w:rPr>
-        <w:t>通常与 evidence.collision_visible.timestamp_sec 一致或相差 ≤ 0.2s。</w:t>
-      </w:r>
-    </w:p>
-    <w:p>
-      <w:pPr>
-        <w:pStyle w:val="Heading3"/>
-      </w:pPr>
-      <w:r>
-        <w:t>9.4 时序属性 timestamp_sec 定位通则</w:t>
+        <w:t>通常 start 与 evidence.collision_visible.start_sec 相差 ≤ 0.2s；</w:t>
       </w:r>
     </w:p>
     <w:p>
@@ -4544,7 +4556,15 @@
           <w:color w:val="222222"/>
           <w:sz w:val="18"/>
         </w:rPr>
-        <w:t>① 标「首次可确认」该现象出现的时刻，不标最清晰帧（除非重合）；</w:t>
+        <w:t>瞬时碰撞可令 end = start 或 start+0.2。</w:t>
+      </w:r>
+    </w:p>
+    <w:p>
+      <w:pPr>
+        <w:pStyle w:val="Heading3"/>
+      </w:pPr>
+      <w:r>
+        <w:t>9.4 时序属性 start_sec / end_sec 定位通则</w:t>
       </w:r>
     </w:p>
     <w:p>
@@ -4560,7 +4580,7 @@
           <w:color w:val="222222"/>
           <w:sz w:val="18"/>
         </w:rPr>
-        <w:t>② value=是（或肯定枚举）→ timestamp_sec 必填；</w:t>
+        <w:t>① start：首次可确认出现；end：现象结束/离画/稳定；瞬时可 start=end；</w:t>
       </w:r>
     </w:p>
     <w:p>
@@ -4576,23 +4596,7 @@
           <w:color w:val="222222"/>
           <w:sz w:val="18"/>
         </w:rPr>
-        <w:t xml:space="preserve">   value∈{否,不适用,未标注} → timestamp_sec = null；</w:t>
-      </w:r>
-    </w:p>
-    <w:p>
-      <w:pPr>
-        <w:spacing w:before="0" w:after="0"/>
-        <w:ind w:left="240"/>
-      </w:pPr>
-      <w:r>
-        <w:rPr>
-          <w:rFonts w:ascii="Consolas" w:hAnsi="Consolas" w:eastAsia="Microsoft YaHei"/>
-          <w:b w:val="0"/>
-          <w:i w:val="0"/>
-          <w:color w:val="222222"/>
-          <w:sz w:val="18"/>
-        </w:rPr>
-        <w:t xml:space="preserve">   value=不确定 → 有候选时刻可填，否则 null；</w:t>
+        <w:t>② value=是 → start/end 必填；value∈{否,不适用,未标注} → 均为 null；</w:t>
       </w:r>
     </w:p>
     <w:p>
@@ -4624,7 +4628,7 @@
           <w:color w:val="222222"/>
           <w:sz w:val="18"/>
         </w:rPr>
-        <w:t xml:space="preserve">   后果类（people_exit_vehicle、bypass_behavior、hazard_light 事故后）</w:t>
+        <w:t xml:space="preserve">   后果类通常 ≥ event_start_sec；</w:t>
       </w:r>
     </w:p>
     <w:p>
@@ -4640,7 +4644,7 @@
           <w:color w:val="222222"/>
           <w:sz w:val="18"/>
         </w:rPr>
-        <w:t xml:space="preserve">   通常 ≥ event_start_sec；</w:t>
+        <w:t>④ 帧号换算：sec = round(frame_idx / fps, 1)；</w:t>
       </w:r>
     </w:p>
     <w:p>
@@ -4656,7 +4660,7 @@
           <w:color w:val="222222"/>
           <w:sz w:val="18"/>
         </w:rPr>
-        <w:t>④ 帧号换算：timestamp_sec = round(frame_idx / fps, 1)。</w:t>
+        <w:t>⑤ 位置相关属性同时填写 bbox=[x,y,w,h]（画面左上角坐标系）。</w:t>
       </w:r>
     </w:p>
     <w:p>

</xml_diff>